<commit_message>
Docs: README notebook index (12), ProjectPlan + Case Study updates
</commit_message>
<xml_diff>
--- a/Documentation/CaseStudySE.docx
+++ b/Documentation/CaseStudySE.docx
@@ -900,7 +900,7 @@
                 <w:rFonts w:asciiTheme="minorHAnsi" w:eastAsiaTheme="minorEastAsia" w:hAnsiTheme="minorHAnsi"/>
                 <w:noProof/>
               </w:rPr>
-              <w:tab/>
+              <w:t xml:space="preserve"> </w:t>
             </w:r>
             <w:r>
               <w:rPr>
@@ -984,7 +984,7 @@
                 <w:rFonts w:asciiTheme="minorHAnsi" w:eastAsiaTheme="minorEastAsia" w:hAnsiTheme="minorHAnsi"/>
                 <w:noProof/>
               </w:rPr>
-              <w:tab/>
+              <w:t xml:space="preserve"> </w:t>
             </w:r>
             <w:r>
               <w:rPr>
@@ -1068,7 +1068,7 @@
                 <w:rFonts w:asciiTheme="minorHAnsi" w:eastAsiaTheme="minorEastAsia" w:hAnsiTheme="minorHAnsi"/>
                 <w:noProof/>
               </w:rPr>
-              <w:tab/>
+              <w:t xml:space="preserve"> </w:t>
             </w:r>
             <w:r>
               <w:rPr>
@@ -1497,7 +1497,7 @@
                 <w:rFonts w:asciiTheme="minorHAnsi" w:eastAsiaTheme="minorEastAsia" w:hAnsiTheme="minorHAnsi"/>
                 <w:noProof/>
               </w:rPr>
-              <w:tab/>
+              <w:t xml:space="preserve"> </w:t>
             </w:r>
             <w:r>
               <w:rPr>
@@ -17969,10 +17969,7 @@
       <w:bookmarkStart w:id="55" w:name="_Toc236932648"/>
       <w:r>
         <w:lastRenderedPageBreak/>
-        <w:t>4.</w:t>
-      </w:r>
-      <w:r>
-        <w:t>2 Quality Assurance</w:t>
+        <w:t>4.2 Quality Assurance</w:t>
       </w:r>
       <w:bookmarkEnd w:id="55"/>
     </w:p>
@@ -17982,16 +17979,7 @@
       </w:pPr>
       <w:bookmarkStart w:id="56" w:name="_Toc236932649"/>
       <w:r>
-        <w:t>4.</w:t>
-      </w:r>
-      <w:r>
-        <w:t>2</w:t>
-      </w:r>
-      <w:r>
-        <w:t>.1</w:t>
-      </w:r>
-      <w:r>
-        <w:t xml:space="preserve"> QMS Selection</w:t>
+        <w:t>4.2.1 QMS Selection</w:t>
       </w:r>
       <w:bookmarkEnd w:id="56"/>
     </w:p>
@@ -18074,16 +18062,7 @@
       </w:pPr>
       <w:bookmarkStart w:id="57" w:name="_Toc236932650"/>
       <w:r>
-        <w:t>4.2.</w:t>
-      </w:r>
-      <w:r>
-        <w:t>2</w:t>
-      </w:r>
-      <w:r>
-        <w:t xml:space="preserve"> </w:t>
-      </w:r>
-      <w:r>
-        <w:t>Quality Factors</w:t>
+        <w:t>4.2.2 Quality Factors</w:t>
       </w:r>
       <w:bookmarkEnd w:id="57"/>
     </w:p>
@@ -18447,13 +18426,7 @@
       </w:pPr>
       <w:bookmarkStart w:id="58" w:name="_Toc236932651"/>
       <w:r>
-        <w:t>4.2.</w:t>
-      </w:r>
-      <w:r>
-        <w:t>3</w:t>
-      </w:r>
-      <w:r>
-        <w:t xml:space="preserve"> </w:t>
+        <w:t xml:space="preserve">4.2.3 </w:t>
       </w:r>
       <w:r>
         <w:t>Metrics for Process and Process Measurements</w:t>
@@ -19386,16 +19359,7 @@
       </w:pPr>
       <w:bookmarkStart w:id="59" w:name="_Toc236932652"/>
       <w:r>
-        <w:t>4.2.</w:t>
-      </w:r>
-      <w:r>
-        <w:t>4</w:t>
-      </w:r>
-      <w:r>
-        <w:t xml:space="preserve"> Quality </w:t>
-      </w:r>
-      <w:r>
-        <w:t>Monitoring</w:t>
+        <w:t>4.2.4 Quality Monitoring</w:t>
       </w:r>
       <w:bookmarkEnd w:id="59"/>
     </w:p>
@@ -20142,7 +20106,7 @@
         </w:rPr>
         <w:lastRenderedPageBreak/>
         <w:drawing>
-          <wp:inline distT="0" distB="0" distL="0" distR="0" wp14:anchorId="0A6DD093" wp14:editId="6D5D3AD8">
+          <wp:inline distT="0" distB="0" distL="0" distR="0" wp14:anchorId="0A6DD093" wp14:editId="78EB1D1A">
             <wp:extent cx="2710735" cy="1784350"/>
             <wp:effectExtent l="0" t="0" r="0" b="6350"/>
             <wp:docPr id="1332179098" name="Picture 8"/>
@@ -28875,6 +28839,7 @@
   <w:style w:type="character" w:default="1" w:styleId="DefaultParagraphFont">
     <w:name w:val="Default Paragraph Font"/>
     <w:uiPriority w:val="1"/>
+    <w:semiHidden/>
     <w:unhideWhenUsed/>
   </w:style>
   <w:style w:type="table" w:default="1" w:styleId="TableNormal">

</xml_diff>